<commit_message>
Store daily recap Word us_market_recap_2026-10-30_BJT_us_2026-10-29_final
</commit_message>
<xml_diff>
--- a/reports/us_market_recap_2026-10-30_BJT_us_2026-10-29_final.docx
+++ b/reports/us_market_recap_2026-10-30_BJT_us_2026-10-29_final.docx
@@ -1013,7 +1013,7 @@
                 <w:color w:val="141414"/>
                 <w:sz w:val="16"/>
               </w:rPr>
-              <w:t>101.85 / 102.70 / 7.81万美元</w:t>
+              <w:t>101.83 / 102.72 / 8.17万美元</w:t>
             </w:r>
           </w:p>
         </w:tc>
@@ -1040,7 +1040,7 @@
                 <w:color w:val="141414"/>
                 <w:sz w:val="16"/>
               </w:rPr>
-              <w:t>DXY -0.33% / WTI -0.08% / BTC -3.84%</w:t>
+              <w:t>DXY -0.36% / WTI -0.06% / BTC +0.54%</w:t>
             </w:r>
           </w:p>
         </w:tc>
@@ -1599,10 +1599,10 @@
         <w:rPr>
           <w:shd w:fill="E7E6E6"/>
         </w:rPr>
-        <w:t>GOOG</w:t>
+        <w:t>GOOGL</w:t>
       </w:r>
       <w:r>
-        <w:t xml:space="preserve">（单股异动（行业标签待核））-12.29%。固定 </w:t>
+        <w:t xml:space="preserve">（单股异动（行业标签待核））-12.64%。固定 </w:t>
       </w:r>
       <w:r>
         <w:t>AI</w:t>
@@ -4049,7 +4049,7 @@
                 <w:color w:val="141414"/>
                 <w:sz w:val="16"/>
               </w:rPr>
-              <w:t>单股异动（行业标签待核）；价格 -26.95%；相对SPY -26.57pp；成交 6.23x均量</w:t>
+              <w:t>单股异动（行业标签待核）；价格 -26.95%；相对SPY -26.57pp；成交 10.87x均量</w:t>
             </w:r>
           </w:p>
         </w:tc>
@@ -4678,7 +4678,7 @@
       <w:r>
         <w:drawing>
           <wp:inline xmlns:a="http://schemas.openxmlformats.org/drawingml/2006/main" xmlns:pic="http://schemas.openxmlformats.org/drawingml/2006/picture">
-            <wp:extent cx="5806440" cy="2966794"/>
+            <wp:extent cx="5806440" cy="2971800"/>
             <wp:docPr id="16" name="Picture 16"/>
             <wp:cNvGraphicFramePr>
               <a:graphicFrameLocks noChangeAspect="1"/>
@@ -4699,7 +4699,7 @@
                   <pic:spPr>
                     <a:xfrm>
                       <a:off x="0" y="0"/>
-                      <a:ext cx="5806440" cy="2966794"/>
+                      <a:ext cx="5806440" cy="2971800"/>
                     </a:xfrm>
                     <a:prstGeom prst="rect"/>
                   </pic:spPr>
@@ -4908,7 +4908,7 @@
         <w:t>NOW</w:t>
       </w:r>
       <w:r>
-        <w:t xml:space="preserve"> -26.95%（单股异动（行业标签待核）；成交约6.23x均量）；</w:t>
+        <w:t xml:space="preserve"> -26.95%（单股异动（行业标签待核）；成交约10.87x均量）；</w:t>
       </w:r>
       <w:r>
         <w:t>CRL</w:t>
@@ -4944,10 +4944,10 @@
         <w:rPr>
           <w:shd w:fill="E7E6E6"/>
         </w:rPr>
-        <w:t>GOOG</w:t>
+        <w:t>GOOGL</w:t>
       </w:r>
       <w:r>
-        <w:t xml:space="preserve"> -12.29%（单股异动（行业标签待核）；成交约5.29x均量）。这些名字先记录为价格/成交异常，随后核对同日公告、研报、公司交流、行业数据或传闻原始出处；没有证据时保留“待验”，不把涨跌倒推成原因。</w:t>
+        <w:t xml:space="preserve"> -12.64%（单股异动（行业标签待核）；成交约14.12x均量）。这些名字先记录为价格/成交异常，随后核对同日公告、研报、公司交流、行业数据或传闻原始出处；没有证据时保留“待验”，不把涨跌倒推成原因。</w:t>
       </w:r>
     </w:p>
     <w:p>
@@ -5965,7 +5965,7 @@
       <w:r>
         <w:drawing>
           <wp:inline xmlns:a="http://schemas.openxmlformats.org/drawingml/2006/main" xmlns:pic="http://schemas.openxmlformats.org/drawingml/2006/picture">
-            <wp:extent cx="5806440" cy="2053537"/>
+            <wp:extent cx="5806440" cy="2054686"/>
             <wp:docPr id="23" name="Picture 23"/>
             <wp:cNvGraphicFramePr>
               <a:graphicFrameLocks noChangeAspect="1"/>
@@ -5986,7 +5986,7 @@
                   <pic:spPr>
                     <a:xfrm>
                       <a:off x="0" y="0"/>
-                      <a:ext cx="5806440" cy="2053537"/>
+                      <a:ext cx="5806440" cy="2054686"/>
                     </a:xfrm>
                     <a:prstGeom prst="rect"/>
                   </pic:spPr>
@@ -6018,7 +6018,7 @@
       <w:r>
         <w:drawing>
           <wp:inline xmlns:a="http://schemas.openxmlformats.org/drawingml/2006/main" xmlns:pic="http://schemas.openxmlformats.org/drawingml/2006/picture">
-            <wp:extent cx="5806440" cy="2779401"/>
+            <wp:extent cx="5806440" cy="2782524"/>
             <wp:docPr id="24" name="Picture 24"/>
             <wp:cNvGraphicFramePr>
               <a:graphicFrameLocks noChangeAspect="1"/>
@@ -6039,7 +6039,7 @@
                   <pic:spPr>
                     <a:xfrm>
                       <a:off x="0" y="0"/>
-                      <a:ext cx="5806440" cy="2779401"/>
+                      <a:ext cx="5806440" cy="2782524"/>
                     </a:xfrm>
                     <a:prstGeom prst="rect"/>
                   </pic:spPr>
@@ -6377,7 +6377,7 @@
                 <w:color w:val="141414"/>
                 <w:sz w:val="16"/>
               </w:rPr>
-              <w:t>6.23x均量；相对SPY -26.57pp</w:t>
+              <w:t>10.87x均量；相对SPY -26.57pp</w:t>
             </w:r>
           </w:p>
         </w:tc>
@@ -6657,7 +6657,7 @@
                 <w:color w:val="141414"/>
                 <w:sz w:val="16"/>
               </w:rPr>
-              <w:t>GOOG</w:t>
+              <w:t>GOOGL</w:t>
             </w:r>
           </w:p>
         </w:tc>
@@ -6684,7 +6684,7 @@
                 <w:color w:val="141414"/>
                 <w:sz w:val="16"/>
               </w:rPr>
-              <w:t>单股异动（行业标签待核） -12.29%</w:t>
+              <w:t>单股异动（行业标签待核） -12.64%</w:t>
             </w:r>
           </w:p>
         </w:tc>
@@ -6710,7 +6710,7 @@
                 <w:color w:val="141414"/>
                 <w:sz w:val="16"/>
               </w:rPr>
-              <w:t>5.29x均量；相对SPY -11.91pp</w:t>
+              <w:t>14.12x均量；相对SPY -12.26pp</w:t>
             </w:r>
           </w:p>
         </w:tc>
@@ -7212,7 +7212,7 @@
                 <w:color w:val="141414"/>
                 <w:sz w:val="16"/>
               </w:rPr>
-              <w:t>不可得</w:t>
+              <w:t>2026-10-30</w:t>
             </w:r>
           </w:p>
         </w:tc>
@@ -7238,7 +7238,7 @@
                 <w:color w:val="141414"/>
                 <w:sz w:val="16"/>
               </w:rPr>
-              <w:t>nan</w:t>
+              <w:t>1.28</w:t>
             </w:r>
           </w:p>
         </w:tc>
@@ -7264,7 +7264,7 @@
                 <w:color w:val="141414"/>
                 <w:sz w:val="16"/>
               </w:rPr>
-              <w:t>nan%</w:t>
+              <w:t>25.3%</w:t>
             </w:r>
           </w:p>
         </w:tc>
@@ -7290,7 +7290,7 @@
                 <w:color w:val="141414"/>
                 <w:sz w:val="16"/>
               </w:rPr>
-              <w:t>source unavailable</w:t>
+              <w:t>strike-concentration</w:t>
             </w:r>
           </w:p>
         </w:tc>
@@ -7348,7 +7348,7 @@
                 <w:color w:val="141414"/>
                 <w:sz w:val="16"/>
               </w:rPr>
-              <w:t>不可得</w:t>
+              <w:t>2026-10-30</w:t>
             </w:r>
           </w:p>
         </w:tc>
@@ -7374,7 +7374,7 @@
                 <w:color w:val="141414"/>
                 <w:sz w:val="16"/>
               </w:rPr>
-              <w:t>nan</w:t>
+              <w:t>1.65</w:t>
             </w:r>
           </w:p>
         </w:tc>
@@ -7400,7 +7400,7 @@
                 <w:color w:val="141414"/>
                 <w:sz w:val="16"/>
               </w:rPr>
-              <w:t>nan%</w:t>
+              <w:t>23.9%</w:t>
             </w:r>
           </w:p>
         </w:tc>
@@ -7426,7 +7426,7 @@
                 <w:color w:val="141414"/>
                 <w:sz w:val="16"/>
               </w:rPr>
-              <w:t>source unavailable</w:t>
+              <w:t>strike-concentration</w:t>
             </w:r>
           </w:p>
         </w:tc>
@@ -7620,7 +7620,7 @@
                 <w:color w:val="141414"/>
                 <w:sz w:val="16"/>
               </w:rPr>
-              <w:t>不可得</w:t>
+              <w:t>2026-10-30</w:t>
             </w:r>
           </w:p>
         </w:tc>
@@ -7646,7 +7646,7 @@
                 <w:color w:val="141414"/>
                 <w:sz w:val="16"/>
               </w:rPr>
-              <w:t>nan</w:t>
+              <w:t>1.64</w:t>
             </w:r>
           </w:p>
         </w:tc>
@@ -7672,7 +7672,7 @@
                 <w:color w:val="141414"/>
                 <w:sz w:val="16"/>
               </w:rPr>
-              <w:t>nan%</w:t>
+              <w:t>9.1%</w:t>
             </w:r>
           </w:p>
         </w:tc>
@@ -7698,7 +7698,7 @@
                 <w:color w:val="141414"/>
                 <w:sz w:val="16"/>
               </w:rPr>
-              <w:t>source unavailable</w:t>
+              <w:t>无阈值报警</w:t>
             </w:r>
           </w:p>
         </w:tc>
@@ -7892,7 +7892,7 @@
                 <w:color w:val="141414"/>
                 <w:sz w:val="16"/>
               </w:rPr>
-              <w:t>不可得</w:t>
+              <w:t>2026-10-30</w:t>
             </w:r>
           </w:p>
         </w:tc>
@@ -7918,7 +7918,7 @@
                 <w:color w:val="141414"/>
                 <w:sz w:val="16"/>
               </w:rPr>
-              <w:t>nan</w:t>
+              <w:t>1.41</w:t>
             </w:r>
           </w:p>
         </w:tc>
@@ -7944,7 +7944,7 @@
                 <w:color w:val="141414"/>
                 <w:sz w:val="16"/>
               </w:rPr>
-              <w:t>nan%</w:t>
+              <w:t>19.3%</w:t>
             </w:r>
           </w:p>
         </w:tc>
@@ -7970,7 +7970,7 @@
                 <w:color w:val="141414"/>
                 <w:sz w:val="16"/>
               </w:rPr>
-              <w:t>source unavailable</w:t>
+              <w:t>无阈值报警</w:t>
             </w:r>
           </w:p>
         </w:tc>
@@ -8300,7 +8300,7 @@
                 <w:color w:val="141414"/>
                 <w:sz w:val="16"/>
               </w:rPr>
-              <w:t>不可得</w:t>
+              <w:t>2026-10-30</w:t>
             </w:r>
           </w:p>
         </w:tc>
@@ -8326,7 +8326,7 @@
                 <w:color w:val="141414"/>
                 <w:sz w:val="16"/>
               </w:rPr>
-              <w:t>nan</w:t>
+              <w:t>0.83</w:t>
             </w:r>
           </w:p>
         </w:tc>
@@ -8352,7 +8352,7 @@
                 <w:color w:val="141414"/>
                 <w:sz w:val="16"/>
               </w:rPr>
-              <w:t>nan%</w:t>
+              <w:t>38.6%</w:t>
             </w:r>
           </w:p>
         </w:tc>
@@ -8378,7 +8378,7 @@
                 <w:color w:val="141414"/>
                 <w:sz w:val="16"/>
               </w:rPr>
-              <w:t>source unavailable</w:t>
+              <w:t>put-heavy, put-volume/OI&gt;=2, strike-concentration</w:t>
             </w:r>
           </w:p>
         </w:tc>
@@ -8708,7 +8708,7 @@
                 <w:color w:val="141414"/>
                 <w:sz w:val="16"/>
               </w:rPr>
-              <w:t>不可得</w:t>
+              <w:t>2026-10-30</w:t>
             </w:r>
           </w:p>
         </w:tc>
@@ -8734,7 +8734,7 @@
                 <w:color w:val="141414"/>
                 <w:sz w:val="16"/>
               </w:rPr>
-              <w:t>nan</w:t>
+              <w:t>1.14</w:t>
             </w:r>
           </w:p>
         </w:tc>
@@ -8760,7 +8760,7 @@
                 <w:color w:val="141414"/>
                 <w:sz w:val="16"/>
               </w:rPr>
-              <w:t>nan%</w:t>
+              <w:t>19.1%</w:t>
             </w:r>
           </w:p>
         </w:tc>
@@ -8786,7 +8786,7 @@
                 <w:color w:val="141414"/>
                 <w:sz w:val="16"/>
               </w:rPr>
-              <w:t>source unavailable</w:t>
+              <w:t>无阈值报警</w:t>
             </w:r>
           </w:p>
         </w:tc>
@@ -9077,7 +9077,7 @@
       <w:r>
         <w:drawing>
           <wp:inline xmlns:a="http://schemas.openxmlformats.org/drawingml/2006/main" xmlns:pic="http://schemas.openxmlformats.org/drawingml/2006/picture">
-            <wp:extent cx="5806440" cy="3656390"/>
+            <wp:extent cx="5806440" cy="2964011"/>
             <wp:docPr id="25" name="Picture 25"/>
             <wp:cNvGraphicFramePr>
               <a:graphicFrameLocks noChangeAspect="1"/>
@@ -9098,7 +9098,7 @@
                   <pic:spPr>
                     <a:xfrm>
                       <a:off x="0" y="0"/>
-                      <a:ext cx="5806440" cy="3656390"/>
+                      <a:ext cx="5806440" cy="2964011"/>
                     </a:xfrm>
                     <a:prstGeom prst="rect"/>
                   </pic:spPr>
@@ -9119,7 +9119,7 @@
           <w:color w:val="555555"/>
           <w:sz w:val="17"/>
         </w:rPr>
-        <w:t>图：公开期权链异常扫描。来源/口径：Nasdaq public option-chain endpoint；检查时点 2026-10-29T19:45:03-04:00；无执行方向确认。。</w:t>
+        <w:t>图：公开期权链异常扫描。来源/口径：Nasdaq public option-chain endpoint；检查时点 2026-10-29T20:44:49-04:00；无执行方向确认。。</w:t>
       </w:r>
     </w:p>
     <w:p>
@@ -9169,25 +9169,7 @@
         <w:rPr>
           <w:shd w:fill="E7E6E6"/>
         </w:rPr>
-        <w:t>MU</w:t>
-      </w:r>
-      <w:r>
-        <w:t xml:space="preserve">, </w:t>
-      </w:r>
-      <w:r>
-        <w:rPr>
-          <w:shd w:fill="E7E6E6"/>
-        </w:rPr>
         <w:t>SNDK</w:t>
-      </w:r>
-      <w:r>
-        <w:t xml:space="preserve">, </w:t>
-      </w:r>
-      <w:r>
-        <w:rPr>
-          <w:shd w:fill="E7E6E6"/>
-        </w:rPr>
-        <w:t>NVDA</w:t>
       </w:r>
       <w:r>
         <w:t xml:space="preserve">, </w:t>
@@ -9209,15 +9191,6 @@
       </w:r>
       <w:r>
         <w:t>TWST</w:t>
-      </w:r>
-      <w:r>
-        <w:t xml:space="preserve">, </w:t>
-      </w:r>
-      <w:r>
-        <w:rPr>
-          <w:shd w:fill="E7E6E6"/>
-        </w:rPr>
-        <w:t>CRDO</w:t>
       </w:r>
       <w:r>
         <w:t xml:space="preserve">, </w:t>
@@ -9260,7 +9233,7 @@
       <w:r>
         <w:drawing>
           <wp:inline xmlns:a="http://schemas.openxmlformats.org/drawingml/2006/main" xmlns:pic="http://schemas.openxmlformats.org/drawingml/2006/picture">
-            <wp:extent cx="5806440" cy="2272509"/>
+            <wp:extent cx="5806440" cy="3199069"/>
             <wp:docPr id="26" name="Picture 26"/>
             <wp:cNvGraphicFramePr>
               <a:graphicFrameLocks noChangeAspect="1"/>
@@ -9281,7 +9254,7 @@
                   <pic:spPr>
                     <a:xfrm>
                       <a:off x="0" y="0"/>
-                      <a:ext cx="5806440" cy="2272509"/>
+                      <a:ext cx="5806440" cy="3199069"/>
                     </a:xfrm>
                     <a:prstGeom prst="rect"/>
                   </pic:spPr>

</xml_diff>